<commit_message>
Add approximate budget section to the Word document
</commit_message>
<xml_diff>
--- a/docs/Architecture_and_Proposed_Solution.docx
+++ b/docs/Architecture_and_Proposed_Solution.docx
@@ -2392,7 +2392,977 @@
         <w:rPr>
           <w:color w:val="075E54"/>
         </w:rPr>
-        <w:t>12. Limitations and Future Work</w:t>
+        <w:t>12. Approximate Budget</w:t>
+      </w:r>
+    </w:p>
+    <w:p>
+      <w:r>
+        <w:t>All figures are approximate USD based on published 2026 rates. WhatsApp and model prices change periodically, so verify before committing. Costs scale roughly linearly with message volume and are dominated by per-message WhatsApp fees; the AI cost is negligible at these volumes.</w:t>
+      </w:r>
+    </w:p>
+    <w:p>
+      <w:pPr>
+        <w:pStyle w:val="Heading2"/>
+      </w:pPr>
+      <w:r>
+        <w:rPr>
+          <w:color w:val="075E54"/>
+        </w:rPr>
+        <w:t>12.1 Unit rates used</w:t>
+      </w:r>
+    </w:p>
+    <w:tbl>
+      <w:tblPr>
+        <w:tblStyle w:val="LightGrid-Accent1"/>
+        <w:tblW w:type="auto" w:w="0"/>
+        <w:tblLook w:firstColumn="1" w:firstRow="1" w:lastColumn="0" w:lastRow="0" w:noHBand="0" w:noVBand="1" w:val="04A0"/>
+      </w:tblPr>
+      <w:tblGrid>
+        <w:gridCol w:w="2880"/>
+        <w:gridCol w:w="2880"/>
+        <w:gridCol w:w="2880"/>
+      </w:tblGrid>
+      <w:tr>
+        <w:tc>
+          <w:tcPr>
+            <w:tcW w:type="dxa" w:w="2880"/>
+          </w:tcPr>
+          <w:p>
+            <w:r/>
+            <w:r>
+              <w:rPr>
+                <w:b/>
+              </w:rPr>
+              <w:t>Item</w:t>
+            </w:r>
+          </w:p>
+        </w:tc>
+        <w:tc>
+          <w:tcPr>
+            <w:tcW w:type="dxa" w:w="2880"/>
+          </w:tcPr>
+          <w:p>
+            <w:r/>
+            <w:r>
+              <w:rPr>
+                <w:b/>
+              </w:rPr>
+              <w:t>Approx. rate</w:t>
+            </w:r>
+          </w:p>
+        </w:tc>
+        <w:tc>
+          <w:tcPr>
+            <w:tcW w:type="dxa" w:w="2880"/>
+          </w:tcPr>
+          <w:p>
+            <w:r/>
+            <w:r>
+              <w:rPr>
+                <w:b/>
+              </w:rPr>
+              <w:t>Notes</w:t>
+            </w:r>
+          </w:p>
+        </w:tc>
+      </w:tr>
+      <w:tr>
+        <w:tc>
+          <w:tcPr>
+            <w:tcW w:type="dxa" w:w="2880"/>
+          </w:tcPr>
+          <w:p>
+            <w:r>
+              <w:t>Twilio WhatsApp handling fee</w:t>
+            </w:r>
+          </w:p>
+        </w:tc>
+        <w:tc>
+          <w:tcPr>
+            <w:tcW w:type="dxa" w:w="2880"/>
+          </w:tcPr>
+          <w:p>
+            <w:r>
+              <w:t>$0.005 per message</w:t>
+            </w:r>
+          </w:p>
+        </w:tc>
+        <w:tc>
+          <w:tcPr>
+            <w:tcW w:type="dxa" w:w="2880"/>
+          </w:tcPr>
+          <w:p>
+            <w:r>
+              <w:t>Charged for inbound and outbound messages.</w:t>
+            </w:r>
+          </w:p>
+        </w:tc>
+      </w:tr>
+      <w:tr>
+        <w:tc>
+          <w:tcPr>
+            <w:tcW w:type="dxa" w:w="2880"/>
+          </w:tcPr>
+          <w:p>
+            <w:r>
+              <w:t>Meta India service message (user-initiated, 24h window)</w:t>
+            </w:r>
+          </w:p>
+        </w:tc>
+        <w:tc>
+          <w:tcPr>
+            <w:tcW w:type="dxa" w:w="2880"/>
+          </w:tcPr>
+          <w:p>
+            <w:r>
+              <w:t>First 1,000/month free, then ~$0.003</w:t>
+            </w:r>
+          </w:p>
+        </w:tc>
+        <w:tc>
+          <w:tcPr>
+            <w:tcW w:type="dxa" w:w="2880"/>
+          </w:tcPr>
+          <w:p>
+            <w:r>
+              <w:t>The maker's free-form replies fall here.</w:t>
+            </w:r>
+          </w:p>
+        </w:tc>
+      </w:tr>
+      <w:tr>
+        <w:tc>
+          <w:tcPr>
+            <w:tcW w:type="dxa" w:w="2880"/>
+          </w:tcPr>
+          <w:p>
+            <w:r>
+              <w:t>Meta India utility template</w:t>
+            </w:r>
+          </w:p>
+        </w:tc>
+        <w:tc>
+          <w:tcPr>
+            <w:tcW w:type="dxa" w:w="2880"/>
+          </w:tcPr>
+          <w:p>
+            <w:r>
+              <w:t>~$0.0014 per message</w:t>
+            </w:r>
+          </w:p>
+        </w:tc>
+        <w:tc>
+          <w:tcPr>
+            <w:tcW w:type="dxa" w:w="2880"/>
+          </w:tcPr>
+          <w:p>
+            <w:r>
+              <w:t>Only needed outside the 24-hour window.</w:t>
+            </w:r>
+          </w:p>
+        </w:tc>
+      </w:tr>
+      <w:tr>
+        <w:tc>
+          <w:tcPr>
+            <w:tcW w:type="dxa" w:w="2880"/>
+          </w:tcPr>
+          <w:p>
+            <w:r>
+              <w:t>OpenAI gpt-4o-mini</w:t>
+            </w:r>
+          </w:p>
+        </w:tc>
+        <w:tc>
+          <w:tcPr>
+            <w:tcW w:type="dxa" w:w="2880"/>
+          </w:tcPr>
+          <w:p>
+            <w:r>
+              <w:t>$0.15 / 1M input, $0.60 / 1M output</w:t>
+            </w:r>
+          </w:p>
+        </w:tc>
+        <w:tc>
+          <w:tcPr>
+            <w:tcW w:type="dxa" w:w="2880"/>
+          </w:tcPr>
+          <w:p>
+            <w:r>
+              <w:t>About $0.002-0.005 per listing (extraction + draft + guard).</w:t>
+            </w:r>
+          </w:p>
+        </w:tc>
+      </w:tr>
+      <w:tr>
+        <w:tc>
+          <w:tcPr>
+            <w:tcW w:type="dxa" w:w="2880"/>
+          </w:tcPr>
+          <w:p>
+            <w:r>
+              <w:t>OpenAI Whisper transcription</w:t>
+            </w:r>
+          </w:p>
+        </w:tc>
+        <w:tc>
+          <w:tcPr>
+            <w:tcW w:type="dxa" w:w="2880"/>
+          </w:tcPr>
+          <w:p>
+            <w:r>
+              <w:t>$0.006 per minute</w:t>
+            </w:r>
+          </w:p>
+        </w:tc>
+        <w:tc>
+          <w:tcPr>
+            <w:tcW w:type="dxa" w:w="2880"/>
+          </w:tcPr>
+          <w:p>
+            <w:r>
+              <w:t>A 30-second voice note costs about $0.003.</w:t>
+            </w:r>
+          </w:p>
+        </w:tc>
+      </w:tr>
+      <w:tr>
+        <w:tc>
+          <w:tcPr>
+            <w:tcW w:type="dxa" w:w="2880"/>
+          </w:tcPr>
+          <w:p>
+            <w:r>
+              <w:t>Phone number (production only)</w:t>
+            </w:r>
+          </w:p>
+        </w:tc>
+        <w:tc>
+          <w:tcPr>
+            <w:tcW w:type="dxa" w:w="2880"/>
+          </w:tcPr>
+          <w:p>
+            <w:r>
+              <w:t>~$1.15 per month</w:t>
+            </w:r>
+          </w:p>
+        </w:tc>
+        <w:tc>
+          <w:tcPr>
+            <w:tcW w:type="dxa" w:w="2880"/>
+          </w:tcPr>
+          <w:p>
+            <w:r>
+              <w:t>Not required for the sandbox/trial sender.</w:t>
+            </w:r>
+          </w:p>
+        </w:tc>
+      </w:tr>
+      <w:tr>
+        <w:tc>
+          <w:tcPr>
+            <w:tcW w:type="dxa" w:w="2880"/>
+          </w:tcPr>
+          <w:p>
+            <w:r>
+              <w:t>Public tunnel</w:t>
+            </w:r>
+          </w:p>
+        </w:tc>
+        <w:tc>
+          <w:tcPr>
+            <w:tcW w:type="dxa" w:w="2880"/>
+          </w:tcPr>
+          <w:p>
+            <w:r>
+              <w:t>$0 (cloudflared) / ~$8 per month (ngrok static domain)</w:t>
+            </w:r>
+          </w:p>
+        </w:tc>
+        <w:tc>
+          <w:tcPr>
+            <w:tcW w:type="dxa" w:w="2880"/>
+          </w:tcPr>
+          <w:p>
+            <w:r>
+              <w:t>Trycloudflare is free but the URL is ephemeral.</w:t>
+            </w:r>
+          </w:p>
+        </w:tc>
+      </w:tr>
+      <w:tr>
+        <w:tc>
+          <w:tcPr>
+            <w:tcW w:type="dxa" w:w="2880"/>
+          </w:tcPr>
+          <w:p>
+            <w:r>
+              <w:t>Hosting</w:t>
+            </w:r>
+          </w:p>
+        </w:tc>
+        <w:tc>
+          <w:tcPr>
+            <w:tcW w:type="dxa" w:w="2880"/>
+          </w:tcPr>
+          <w:p>
+            <w:r>
+              <w:t>$0 local / ~$5-25 per month cloud</w:t>
+            </w:r>
+          </w:p>
+        </w:tc>
+        <w:tc>
+          <w:tcPr>
+            <w:tcW w:type="dxa" w:w="2880"/>
+          </w:tcPr>
+          <w:p>
+            <w:r>
+              <w:t>Running on the maker's laptop is $0.</w:t>
+            </w:r>
+          </w:p>
+        </w:tc>
+      </w:tr>
+      <w:tr>
+        <w:tc>
+          <w:tcPr>
+            <w:tcW w:type="dxa" w:w="2880"/>
+          </w:tcPr>
+          <w:p>
+            <w:r>
+              <w:t>Domain (optional)</w:t>
+            </w:r>
+          </w:p>
+        </w:tc>
+        <w:tc>
+          <w:tcPr>
+            <w:tcW w:type="dxa" w:w="2880"/>
+          </w:tcPr>
+          <w:p>
+            <w:r>
+              <w:t>~$10-15 per year</w:t>
+            </w:r>
+          </w:p>
+        </w:tc>
+        <w:tc>
+          <w:tcPr>
+            <w:tcW w:type="dxa" w:w="2880"/>
+          </w:tcPr>
+          <w:p>
+            <w:r>
+              <w:t>Only for a branded buyer link.</w:t>
+            </w:r>
+          </w:p>
+        </w:tc>
+      </w:tr>
+    </w:tbl>
+    <w:p/>
+    <w:p>
+      <w:pPr>
+        <w:pStyle w:val="Heading2"/>
+      </w:pPr>
+      <w:r>
+        <w:rPr>
+          <w:color w:val="075E54"/>
+        </w:rPr>
+        <w:t>12.2 Scenario A - Hackathon demo / prototype (this build)</w:t>
+      </w:r>
+    </w:p>
+    <w:tbl>
+      <w:tblPr>
+        <w:tblStyle w:val="LightGrid-Accent1"/>
+        <w:tblW w:type="auto" w:w="0"/>
+        <w:tblLook w:firstColumn="1" w:firstRow="1" w:lastColumn="0" w:lastRow="0" w:noHBand="0" w:noVBand="1" w:val="04A0"/>
+      </w:tblPr>
+      <w:tblGrid>
+        <w:gridCol w:w="4320"/>
+        <w:gridCol w:w="4320"/>
+      </w:tblGrid>
+      <w:tr>
+        <w:tc>
+          <w:tcPr>
+            <w:tcW w:type="dxa" w:w="4320"/>
+          </w:tcPr>
+          <w:p>
+            <w:r/>
+            <w:r>
+              <w:rPr>
+                <w:b/>
+              </w:rPr>
+              <w:t>Line item</w:t>
+            </w:r>
+          </w:p>
+        </w:tc>
+        <w:tc>
+          <w:tcPr>
+            <w:tcW w:type="dxa" w:w="4320"/>
+          </w:tcPr>
+          <w:p>
+            <w:r/>
+            <w:r>
+              <w:rPr>
+                <w:b/>
+              </w:rPr>
+              <w:t>Cost</w:t>
+            </w:r>
+          </w:p>
+        </w:tc>
+      </w:tr>
+      <w:tr>
+        <w:tc>
+          <w:tcPr>
+            <w:tcW w:type="dxa" w:w="4320"/>
+          </w:tcPr>
+          <w:p>
+            <w:r>
+              <w:t>Twilio WhatsApp trial</w:t>
+            </w:r>
+          </w:p>
+        </w:tc>
+        <w:tc>
+          <w:tcPr>
+            <w:tcW w:type="dxa" w:w="4320"/>
+          </w:tcPr>
+          <w:p>
+            <w:r>
+              <w:t>$0 (free trial credit, typically ~$15)</w:t>
+            </w:r>
+          </w:p>
+        </w:tc>
+      </w:tr>
+      <w:tr>
+        <w:tc>
+          <w:tcPr>
+            <w:tcW w:type="dxa" w:w="4320"/>
+          </w:tcPr>
+          <w:p>
+            <w:r>
+              <w:t>OpenAI API</w:t>
+            </w:r>
+          </w:p>
+        </w:tc>
+        <w:tc>
+          <w:tcPr>
+            <w:tcW w:type="dxa" w:w="4320"/>
+          </w:tcPr>
+          <w:p>
+            <w:r>
+              <w:t>~$0 using the offline mock; under $1 with a key</w:t>
+            </w:r>
+          </w:p>
+        </w:tc>
+      </w:tr>
+      <w:tr>
+        <w:tc>
+          <w:tcPr>
+            <w:tcW w:type="dxa" w:w="4320"/>
+          </w:tcPr>
+          <w:p>
+            <w:r>
+              <w:t>Public tunnel</w:t>
+            </w:r>
+          </w:p>
+        </w:tc>
+        <w:tc>
+          <w:tcPr>
+            <w:tcW w:type="dxa" w:w="4320"/>
+          </w:tcPr>
+          <w:p>
+            <w:r>
+              <w:t>$0 (cloudflared)</w:t>
+            </w:r>
+          </w:p>
+        </w:tc>
+      </w:tr>
+      <w:tr>
+        <w:tc>
+          <w:tcPr>
+            <w:tcW w:type="dxa" w:w="4320"/>
+          </w:tcPr>
+          <w:p>
+            <w:r>
+              <w:t>Hosting</w:t>
+            </w:r>
+          </w:p>
+        </w:tc>
+        <w:tc>
+          <w:tcPr>
+            <w:tcW w:type="dxa" w:w="4320"/>
+          </w:tcPr>
+          <w:p>
+            <w:r>
+              <w:t>$0 (runs on the maker's machine)</w:t>
+            </w:r>
+          </w:p>
+        </w:tc>
+      </w:tr>
+      <w:tr>
+        <w:tc>
+          <w:tcPr>
+            <w:tcW w:type="dxa" w:w="4320"/>
+          </w:tcPr>
+          <w:p>
+            <w:r>
+              <w:t>Total</w:t>
+            </w:r>
+          </w:p>
+        </w:tc>
+        <w:tc>
+          <w:tcPr>
+            <w:tcW w:type="dxa" w:w="4320"/>
+          </w:tcPr>
+          <w:p>
+            <w:r>
+              <w:t>~$0</w:t>
+            </w:r>
+          </w:p>
+        </w:tc>
+      </w:tr>
+    </w:tbl>
+    <w:p/>
+    <w:p>
+      <w:pPr>
+        <w:pStyle w:val="Heading2"/>
+      </w:pPr>
+      <w:r>
+        <w:rPr>
+          <w:color w:val="075E54"/>
+        </w:rPr>
+        <w:t>12.3 Scenario B - Pilot with a friend (about 100 listings, ~1,200 messages/month)</w:t>
+      </w:r>
+    </w:p>
+    <w:tbl>
+      <w:tblPr>
+        <w:tblStyle w:val="LightGrid-Accent1"/>
+        <w:tblW w:type="auto" w:w="0"/>
+        <w:tblLook w:firstColumn="1" w:firstRow="1" w:lastColumn="0" w:lastRow="0" w:noHBand="0" w:noVBand="1" w:val="04A0"/>
+      </w:tblPr>
+      <w:tblGrid>
+        <w:gridCol w:w="4320"/>
+        <w:gridCol w:w="4320"/>
+      </w:tblGrid>
+      <w:tr>
+        <w:tc>
+          <w:tcPr>
+            <w:tcW w:type="dxa" w:w="4320"/>
+          </w:tcPr>
+          <w:p>
+            <w:r/>
+            <w:r>
+              <w:rPr>
+                <w:b/>
+              </w:rPr>
+              <w:t>Line item</w:t>
+            </w:r>
+          </w:p>
+        </w:tc>
+        <w:tc>
+          <w:tcPr>
+            <w:tcW w:type="dxa" w:w="4320"/>
+          </w:tcPr>
+          <w:p>
+            <w:r/>
+            <w:r>
+              <w:rPr>
+                <w:b/>
+              </w:rPr>
+              <w:t>Approx. monthly cost</w:t>
+            </w:r>
+          </w:p>
+        </w:tc>
+      </w:tr>
+      <w:tr>
+        <w:tc>
+          <w:tcPr>
+            <w:tcW w:type="dxa" w:w="4320"/>
+          </w:tcPr>
+          <w:p>
+            <w:r>
+              <w:t>Twilio handling (1,200 messages x $0.005)</w:t>
+            </w:r>
+          </w:p>
+        </w:tc>
+        <w:tc>
+          <w:tcPr>
+            <w:tcW w:type="dxa" w:w="4320"/>
+          </w:tcPr>
+          <w:p>
+            <w:r>
+              <w:t>$6.00</w:t>
+            </w:r>
+          </w:p>
+        </w:tc>
+      </w:tr>
+      <w:tr>
+        <w:tc>
+          <w:tcPr>
+            <w:tcW w:type="dxa" w:w="4320"/>
+          </w:tcPr>
+          <w:p>
+            <w:r>
+              <w:t>Meta service fees (about 200 beyond the free 1,000)</w:t>
+            </w:r>
+          </w:p>
+        </w:tc>
+        <w:tc>
+          <w:tcPr>
+            <w:tcW w:type="dxa" w:w="4320"/>
+          </w:tcPr>
+          <w:p>
+            <w:r>
+              <w:t>$0.60</w:t>
+            </w:r>
+          </w:p>
+        </w:tc>
+      </w:tr>
+      <w:tr>
+        <w:tc>
+          <w:tcPr>
+            <w:tcW w:type="dxa" w:w="4320"/>
+          </w:tcPr>
+          <w:p>
+            <w:r>
+              <w:t>OpenAI listing generation (100 listings)</w:t>
+            </w:r>
+          </w:p>
+        </w:tc>
+        <w:tc>
+          <w:tcPr>
+            <w:tcW w:type="dxa" w:w="4320"/>
+          </w:tcPr>
+          <w:p>
+            <w:r>
+              <w:t>~$0.30</w:t>
+            </w:r>
+          </w:p>
+        </w:tc>
+      </w:tr>
+      <w:tr>
+        <w:tc>
+          <w:tcPr>
+            <w:tcW w:type="dxa" w:w="4320"/>
+          </w:tcPr>
+          <w:p>
+            <w:r>
+              <w:t>Whisper voice (100 x 30 seconds)</w:t>
+            </w:r>
+          </w:p>
+        </w:tc>
+        <w:tc>
+          <w:tcPr>
+            <w:tcW w:type="dxa" w:w="4320"/>
+          </w:tcPr>
+          <w:p>
+            <w:r>
+              <w:t>~$0.30</w:t>
+            </w:r>
+          </w:p>
+        </w:tc>
+      </w:tr>
+      <w:tr>
+        <w:tc>
+          <w:tcPr>
+            <w:tcW w:type="dxa" w:w="4320"/>
+          </w:tcPr>
+          <w:p>
+            <w:r>
+              <w:t>Tunnel + hosting</w:t>
+            </w:r>
+          </w:p>
+        </w:tc>
+        <w:tc>
+          <w:tcPr>
+            <w:tcW w:type="dxa" w:w="4320"/>
+          </w:tcPr>
+          <w:p>
+            <w:r>
+              <w:t>$0</w:t>
+            </w:r>
+          </w:p>
+        </w:tc>
+      </w:tr>
+      <w:tr>
+        <w:tc>
+          <w:tcPr>
+            <w:tcW w:type="dxa" w:w="4320"/>
+          </w:tcPr>
+          <w:p>
+            <w:r>
+              <w:t>Total</w:t>
+            </w:r>
+          </w:p>
+        </w:tc>
+        <w:tc>
+          <w:tcPr>
+            <w:tcW w:type="dxa" w:w="4320"/>
+          </w:tcPr>
+          <w:p>
+            <w:r>
+              <w:t>~$7 (well under $10)</w:t>
+            </w:r>
+          </w:p>
+        </w:tc>
+      </w:tr>
+    </w:tbl>
+    <w:p/>
+    <w:p>
+      <w:pPr>
+        <w:pStyle w:val="Heading2"/>
+      </w:pPr>
+      <w:r>
+        <w:rPr>
+          <w:color w:val="075E54"/>
+        </w:rPr>
+        <w:t>12.4 Scenario C - Production (about 1,000 listings, ~12,000 messages/month)</w:t>
+      </w:r>
+    </w:p>
+    <w:tbl>
+      <w:tblPr>
+        <w:tblStyle w:val="LightGrid-Accent1"/>
+        <w:tblW w:type="auto" w:w="0"/>
+        <w:tblLook w:firstColumn="1" w:firstRow="1" w:lastColumn="0" w:lastRow="0" w:noHBand="0" w:noVBand="1" w:val="04A0"/>
+      </w:tblPr>
+      <w:tblGrid>
+        <w:gridCol w:w="4320"/>
+        <w:gridCol w:w="4320"/>
+      </w:tblGrid>
+      <w:tr>
+        <w:tc>
+          <w:tcPr>
+            <w:tcW w:type="dxa" w:w="4320"/>
+          </w:tcPr>
+          <w:p>
+            <w:r/>
+            <w:r>
+              <w:rPr>
+                <w:b/>
+              </w:rPr>
+              <w:t>Line item</w:t>
+            </w:r>
+          </w:p>
+        </w:tc>
+        <w:tc>
+          <w:tcPr>
+            <w:tcW w:type="dxa" w:w="4320"/>
+          </w:tcPr>
+          <w:p>
+            <w:r/>
+            <w:r>
+              <w:rPr>
+                <w:b/>
+              </w:rPr>
+              <w:t>Approx. monthly cost</w:t>
+            </w:r>
+          </w:p>
+        </w:tc>
+      </w:tr>
+      <w:tr>
+        <w:tc>
+          <w:tcPr>
+            <w:tcW w:type="dxa" w:w="4320"/>
+          </w:tcPr>
+          <w:p>
+            <w:r>
+              <w:t>Twilio handling (12,000 messages x $0.005)</w:t>
+            </w:r>
+          </w:p>
+        </w:tc>
+        <w:tc>
+          <w:tcPr>
+            <w:tcW w:type="dxa" w:w="4320"/>
+          </w:tcPr>
+          <w:p>
+            <w:r>
+              <w:t>$60</w:t>
+            </w:r>
+          </w:p>
+        </w:tc>
+      </w:tr>
+      <w:tr>
+        <w:tc>
+          <w:tcPr>
+            <w:tcW w:type="dxa" w:w="4320"/>
+          </w:tcPr>
+          <w:p>
+            <w:r>
+              <w:t>Meta service fees (about 11,000 beyond the free 1,000)</w:t>
+            </w:r>
+          </w:p>
+        </w:tc>
+        <w:tc>
+          <w:tcPr>
+            <w:tcW w:type="dxa" w:w="4320"/>
+          </w:tcPr>
+          <w:p>
+            <w:r>
+              <w:t>$33</w:t>
+            </w:r>
+          </w:p>
+        </w:tc>
+      </w:tr>
+      <w:tr>
+        <w:tc>
+          <w:tcPr>
+            <w:tcW w:type="dxa" w:w="4320"/>
+          </w:tcPr>
+          <w:p>
+            <w:r>
+              <w:t>Production phone number</w:t>
+            </w:r>
+          </w:p>
+        </w:tc>
+        <w:tc>
+          <w:tcPr>
+            <w:tcW w:type="dxa" w:w="4320"/>
+          </w:tcPr>
+          <w:p>
+            <w:r>
+              <w:t>$1.15</w:t>
+            </w:r>
+          </w:p>
+        </w:tc>
+      </w:tr>
+      <w:tr>
+        <w:tc>
+          <w:tcPr>
+            <w:tcW w:type="dxa" w:w="4320"/>
+          </w:tcPr>
+          <w:p>
+            <w:r>
+              <w:t>OpenAI listing generation (1,000 listings)</w:t>
+            </w:r>
+          </w:p>
+        </w:tc>
+        <w:tc>
+          <w:tcPr>
+            <w:tcW w:type="dxa" w:w="4320"/>
+          </w:tcPr>
+          <w:p>
+            <w:r>
+              <w:t>~$4</w:t>
+            </w:r>
+          </w:p>
+        </w:tc>
+      </w:tr>
+      <w:tr>
+        <w:tc>
+          <w:tcPr>
+            <w:tcW w:type="dxa" w:w="4320"/>
+          </w:tcPr>
+          <w:p>
+            <w:r>
+              <w:t>Whisper voice</w:t>
+            </w:r>
+          </w:p>
+        </w:tc>
+        <w:tc>
+          <w:tcPr>
+            <w:tcW w:type="dxa" w:w="4320"/>
+          </w:tcPr>
+          <w:p>
+            <w:r>
+              <w:t>~$3</w:t>
+            </w:r>
+          </w:p>
+        </w:tc>
+      </w:tr>
+      <w:tr>
+        <w:tc>
+          <w:tcPr>
+            <w:tcW w:type="dxa" w:w="4320"/>
+          </w:tcPr>
+          <w:p>
+            <w:r>
+              <w:t>Hosting + domain</w:t>
+            </w:r>
+          </w:p>
+        </w:tc>
+        <w:tc>
+          <w:tcPr>
+            <w:tcW w:type="dxa" w:w="4320"/>
+          </w:tcPr>
+          <w:p>
+            <w:r>
+              <w:t>~$6-26</w:t>
+            </w:r>
+          </w:p>
+        </w:tc>
+      </w:tr>
+      <w:tr>
+        <w:tc>
+          <w:tcPr>
+            <w:tcW w:type="dxa" w:w="4320"/>
+          </w:tcPr>
+          <w:p>
+            <w:r>
+              <w:t>Total</w:t>
+            </w:r>
+          </w:p>
+        </w:tc>
+        <w:tc>
+          <w:tcPr>
+            <w:tcW w:type="dxa" w:w="4320"/>
+          </w:tcPr>
+          <w:p>
+            <w:r>
+              <w:t>~$110-150</w:t>
+            </w:r>
+          </w:p>
+        </w:tc>
+      </w:tr>
+    </w:tbl>
+    <w:p/>
+    <w:p>
+      <w:pPr>
+        <w:pStyle w:val="Heading2"/>
+      </w:pPr>
+      <w:r>
+        <w:rPr>
+          <w:color w:val="075E54"/>
+        </w:rPr>
+        <w:t>12.5 One-time and non-cash costs</w:t>
+      </w:r>
+    </w:p>
+    <w:p>
+      <w:pPr>
+        <w:pStyle w:val="ListBullet"/>
+      </w:pPr>
+      <w:r>
+        <w:t>Development: $0 in software (open-source stack); the cost is build time (an overnight hackathon).</w:t>
+      </w:r>
+    </w:p>
+    <w:p>
+      <w:pPr>
+        <w:pStyle w:val="ListBullet"/>
+      </w:pPr>
+      <w:r>
+        <w:t>Optional domain: ~$10-15 per year.</w:t>
+      </w:r>
+    </w:p>
+    <w:p>
+      <w:pPr>
+        <w:pStyle w:val="ListBullet"/>
+      </w:pPr>
+      <w:r>
+        <w:t>Some WhatsApp BSPs charge a one-time sender registration fee (roughly $0-50); Twilio's sandbox/trial is free.</w:t>
+      </w:r>
+    </w:p>
+    <w:p>
+      <w:pPr>
+        <w:pStyle w:val="ListBullet"/>
+      </w:pPr>
+      <w:r>
+        <w:t>Rotate the Twilio credentials that were shared in chat before production use.</w:t>
+      </w:r>
+    </w:p>
+    <w:p>
+      <w:pPr>
+        <w:pStyle w:val="Heading1"/>
+      </w:pPr>
+      <w:r>
+        <w:rPr>
+          <w:color w:val="075E54"/>
+        </w:rPr>
+        <w:t>13. Limitations and Future Work</w:t>
       </w:r>
     </w:p>
     <w:tbl>
@@ -2599,7 +3569,7 @@
         <w:rPr>
           <w:color w:val="075E54"/>
         </w:rPr>
-        <w:t>13. Demo Script</w:t>
+        <w:t>14. Demo Script</w:t>
       </w:r>
     </w:p>
     <w:p>
@@ -2666,7 +3636,7 @@
         <w:rPr>
           <w:color w:val="075E54"/>
         </w:rPr>
-        <w:t>14. Glossary</w:t>
+        <w:t>15. Glossary</w:t>
       </w:r>
     </w:p>
     <w:tbl>

</xml_diff>

<commit_message>
Add buyer storefront, knowledge-base Q&A, and WhatsApp escalation loop
Buyers browse /shop, ask questions answered instantly from the product knowledge base, or escalated to the maker on WhatsApp; the maker's text/voice reply is processed into a fact, stored, and returned to the buyer. Updates the architecture diagram, component table, API reference, README and Word doc.
</commit_message>
<xml_diff>
--- a/docs/Architecture_and_Proposed_Solution.docx
+++ b/docs/Architecture_and_Proposed_Solution.docx
@@ -51,6 +51,11 @@
     <w:p>
       <w:r>
         <w:t>The team's core technical contribution is the guard: a hybrid of an LLM claim auditor and a deterministic, default-deny enforcement layer. It is the difference between 'an AI wrote a nice description' and 'an AI wrote a description that is safe to publish for a traditional craft community'.</w:t>
+      </w:r>
+    </w:p>
+    <w:p>
+      <w:r>
+        <w:t>Beyond the listing, buyers interact: they browse a storefront and ask questions. Questions the knowledge base can answer are answered instantly; the rest are escalated to the maker on WhatsApp as text or voice, then processed, stored as new confirmed facts, and returned to the buyer.</w:t>
       </w:r>
     </w:p>
     <w:p>
@@ -556,59 +561,65 @@
           <w:rFonts w:ascii="Consolas" w:hAnsi="Consolas"/>
           <w:sz w:val="18"/>
         </w:rPr>
-        <w:t xml:space="preserve">                         MAKER (WhatsApp)                         BUYER (browser)</w:t>
+        <w:t xml:space="preserve">   MAKER (WhatsApp)                          BUYER (storefront /shop)</w:t>
         <w:br/>
-        <w:t xml:space="preserve">                                |                                      |</w:t>
+        <w:t xml:space="preserve">        |                                              |</w:t>
         <w:br/>
-        <w:t xml:space="preserve">                     voice note / photo / text                 shareable buyer link</w:t>
+        <w:t xml:space="preserve">  voice / photo / text                       browse products, type a question</w:t>
         <w:br/>
-        <w:t xml:space="preserve">                                |                                      |</w:t>
+        <w:t xml:space="preserve">        |                                              |</w:t>
         <w:br/>
-        <w:t xml:space="preserve">                                v                                      v</w:t>
+        <w:t xml:space="preserve">        v                                              v</w:t>
         <w:br/>
-        <w:t xml:space="preserve">                 +----------------------------+          +---------------------------+</w:t>
+        <w:t xml:space="preserve">  +---------------------+                    +------------------------+</w:t>
         <w:br/>
-        <w:t xml:space="preserve">                 |  Twilio WhatsApp (trial)   |          |  Buyer page /buyer/{id}   |</w:t>
+        <w:t xml:space="preserve">  | Twilio WhatsApp     |                    | /shop , /shop/{id}     |</w:t>
         <w:br/>
-        <w:t xml:space="preserve">                 +----------------------------+          +---------------------------+</w:t>
+        <w:t xml:space="preserve">  | (trial sender)      |                    | buyer Q&amp;A page         |</w:t>
         <w:br/>
-        <w:t xml:space="preserve">                                |  POST /webhook/twilio                 ^</w:t>
+        <w:t xml:space="preserve">  +---------------------+                    +------------------------+</w:t>
         <w:br/>
-        <w:t xml:space="preserve">                                v                                       |  GET /api/listing/{id}</w:t>
+        <w:t xml:space="preserve">        |  POST /webhook/twilio                        |  POST /api/buyer/ask</w:t>
         <w:br/>
-        <w:t xml:space="preserve">      +---------------------------------------------------------------------------+</w:t>
+        <w:t xml:space="preserve">        v                                              v</w:t>
         <w:br/>
-        <w:t xml:space="preserve">      |                       FastAPI application (app.py)                       |</w:t>
+        <w:t xml:space="preserve">  +===========================================================================+</w:t>
         <w:br/>
-        <w:t xml:space="preserve">      |                                                                           |</w:t>
+        <w:t xml:space="preserve">  |                     FastAPI application (app.py)                          |</w:t>
         <w:br/>
-        <w:t xml:space="preserve">      |   Transport        Agent orchestrator        Session store (in-memory)    |</w:t>
+        <w:t xml:space="preserve">  |                                                                           |</w:t>
         <w:br/>
-        <w:t xml:space="preserve">      |   (Twilio/TwiML) -&gt; interview -&gt; ledger -&gt;  draft -&gt; GUARD -&gt; reply      |</w:t>
+        <w:t xml:space="preserve">  |  MAKER LOOP                                  BUYER LOOP                    |</w:t>
         <w:br/>
-        <w:t xml:space="preserve">      |            |                         |            |            |         |</w:t>
+        <w:t xml:space="preserve">  |  transport -&gt; interview -&gt; ledger            ask -&gt; kb_answer(facts +      |</w:t>
         <w:br/>
-        <w:t xml:space="preserve">      |            |                         v            v            v         |</w:t>
+        <w:t xml:space="preserve">  |        -&gt; draft -&gt; GUARD -&gt; publish          prior Q&amp;A)                    |</w:t>
         <w:br/>
-        <w:t xml:space="preserve">      |            |                    Claim Ledger   Draft module  Guard       |</w:t>
+        <w:t xml:space="preserve">  |                                                    | hit        | miss     |</w:t>
         <w:br/>
-        <w:t xml:space="preserve">      |            |                    (confirmed     (LLM writer)  (claim       |</w:t>
+        <w:t xml:space="preserve">  |                                                    v            v          |</w:t>
         <w:br/>
-        <w:t xml:space="preserve">      |            |                     facts)                      audit +     |</w:t>
+        <w:t xml:space="preserve">  |                                             instant answer  escalate to   |</w:t>
         <w:br/>
-        <w:t xml:space="preserve">      |            |                                                 repair)     |</w:t>
+        <w:t xml:space="preserve">  |                                                             seller via     |</w:t>
         <w:br/>
-        <w:t xml:space="preserve">      |            v                                                              |</w:t>
+        <w:t xml:space="preserve">  |                                                             send_whatsapp  |</w:t>
         <w:br/>
-        <w:t xml:space="preserve">      |   OpenAI API (chat + Whisper)      Media store (photo bytes -&gt; /media/{id})|</w:t>
+        <w:t xml:space="preserve">  |                                                                           |</w:t>
         <w:br/>
-        <w:t xml:space="preserve">      +---------------------------------------------------------------------------+</w:t>
+        <w:t xml:space="preserve">  |  Claim Ledger / KB  &lt;-- seller answer (voice/text) &lt;-- PENDING queue      |</w:t>
         <w:br/>
-        <w:t xml:space="preserve">                                ^</w:t>
+        <w:t xml:space="preserve">  |  Guard | Draft module | Session store | Media store (/media/{id})         |</w:t>
         <w:br/>
-        <w:t xml:space="preserve">                                |  HTTPS tunnel (cloudflared / ngrok)</w:t>
+        <w:t xml:space="preserve">  |  OpenAI API (chat for extract/draft/guard/KB + Whisper for voice)         |</w:t>
         <w:br/>
-        <w:t xml:space="preserve">                                |  https://&lt;random&gt;.trycloudflare.com/webhook/twilio</w:t>
+        <w:t xml:space="preserve">  +===========================================================================+</w:t>
+        <w:br/>
+        <w:t xml:space="preserve">        ^</w:t>
+        <w:br/>
+        <w:t xml:space="preserve">        |  HTTPS tunnel (cloudflared / ngrok)</w:t>
+        <w:br/>
+        <w:t xml:space="preserve">        |  https://&lt;random&gt;.trycloudflare.com/webhook/twilio</w:t>
       </w:r>
     </w:p>
     <w:p>
@@ -845,6 +856,116 @@
           </w:tcPr>
           <w:p>
             <w:r>
+              <w:t>Storefront (/shop)</w:t>
+            </w:r>
+          </w:p>
+        </w:tc>
+        <w:tc>
+          <w:tcPr>
+            <w:tcW w:type="dxa" w:w="4320"/>
+          </w:tcPr>
+          <w:p>
+            <w:r>
+              <w:t>Lists every published product; buyers browse and open a product.</w:t>
+            </w:r>
+          </w:p>
+        </w:tc>
+      </w:tr>
+      <w:tr>
+        <w:tc>
+          <w:tcPr>
+            <w:tcW w:type="dxa" w:w="4320"/>
+          </w:tcPr>
+          <w:p>
+            <w:r>
+              <w:t>Buyer Q&amp;A</w:t>
+            </w:r>
+          </w:p>
+        </w:tc>
+        <w:tc>
+          <w:tcPr>
+            <w:tcW w:type="dxa" w:w="4320"/>
+          </w:tcPr>
+          <w:p>
+            <w:r>
+              <w:t>Buyer types a question; it is answered from the knowledge base or escalated to the seller.</w:t>
+            </w:r>
+          </w:p>
+        </w:tc>
+      </w:tr>
+      <w:tr>
+        <w:tc>
+          <w:tcPr>
+            <w:tcW w:type="dxa" w:w="4320"/>
+          </w:tcPr>
+          <w:p>
+            <w:r>
+              <w:t>Knowledge-base answering</w:t>
+            </w:r>
+          </w:p>
+        </w:tc>
+        <w:tc>
+          <w:tcPr>
+            <w:tcW w:type="dxa" w:w="4320"/>
+          </w:tcPr>
+          <w:p>
+            <w:r>
+              <w:t>Answers strictly from confirmed facts and previously answered Q&amp;A; never invents.</w:t>
+            </w:r>
+          </w:p>
+        </w:tc>
+      </w:tr>
+      <w:tr>
+        <w:tc>
+          <w:tcPr>
+            <w:tcW w:type="dxa" w:w="4320"/>
+          </w:tcPr>
+          <w:p>
+            <w:r>
+              <w:t>Escalation queue</w:t>
+            </w:r>
+          </w:p>
+        </w:tc>
+        <w:tc>
+          <w:tcPr>
+            <w:tcW w:type="dxa" w:w="4320"/>
+          </w:tcPr>
+          <w:p>
+            <w:r>
+              <w:t>Holds unanswered questions and notifies the seller on WhatsApp via the Messages API.</w:t>
+            </w:r>
+          </w:p>
+        </w:tc>
+      </w:tr>
+      <w:tr>
+        <w:tc>
+          <w:tcPr>
+            <w:tcW w:type="dxa" w:w="4320"/>
+          </w:tcPr>
+          <w:p>
+            <w:r>
+              <w:t>Seller answer intake</w:t>
+            </w:r>
+          </w:p>
+        </w:tc>
+        <w:tc>
+          <w:tcPr>
+            <w:tcW w:type="dxa" w:w="4320"/>
+          </w:tcPr>
+          <w:p>
+            <w:r>
+              <w:t>Seller reply (text or voice) -&gt; transcribe -&gt; extract a fact -&gt; add to the ledger -&gt; return to buyer.</w:t>
+            </w:r>
+          </w:p>
+        </w:tc>
+      </w:tr>
+      <w:tr>
+        <w:tc>
+          <w:tcPr>
+            <w:tcW w:type="dxa" w:w="4320"/>
+          </w:tcPr>
+          <w:p>
+            <w:r>
               <w:t>Simulator UI</w:t>
             </w:r>
           </w:p>
@@ -970,6 +1091,116 @@
       </w:pPr>
       <w:r>
         <w:t>Configuration through environment variables / .env (secrets never committed).</w:t>
+      </w:r>
+    </w:p>
+    <w:p>
+      <w:pPr>
+        <w:pStyle w:val="Heading2"/>
+      </w:pPr>
+      <w:r>
+        <w:rPr>
+          <w:color w:val="075E54"/>
+        </w:rPr>
+        <w:t>4.5 Buyer question loop (knowledge base + seller escalation)</w:t>
+      </w:r>
+    </w:p>
+    <w:p>
+      <w:pPr>
+        <w:pStyle w:val="ListNumber"/>
+      </w:pPr>
+      <w:r>
+        <w:t>Buyer opens the storefront at /shop and a product page at /shop/{id}.</w:t>
+      </w:r>
+    </w:p>
+    <w:p>
+      <w:pPr>
+        <w:pStyle w:val="ListNumber"/>
+      </w:pPr>
+      <w:r>
+        <w:t>Buyer types a question; the page calls POST /api/buyer/ask.</w:t>
+      </w:r>
+    </w:p>
+    <w:p>
+      <w:pPr>
+        <w:pStyle w:val="ListNumber"/>
+      </w:pPr>
+      <w:r>
+        <w:t>kb_answer checks the product's knowledge base (confirmed facts plus previously answered questions).</w:t>
+      </w:r>
+    </w:p>
+    <w:p>
+      <w:pPr>
+        <w:pStyle w:val="ListNumber"/>
+      </w:pPr>
+      <w:r>
+        <w:t>If the answer is present, it is returned instantly and shown in the chat.</w:t>
+      </w:r>
+    </w:p>
+    <w:p>
+      <w:pPr>
+        <w:pStyle w:val="ListNumber"/>
+      </w:pPr>
+      <w:r>
+        <w:t>If not, the question is stored as pending, escalated to the seller over WhatsApp, and the buyer is told the maker is checking.</w:t>
+      </w:r>
+    </w:p>
+    <w:p>
+      <w:pPr>
+        <w:pStyle w:val="ListNumber"/>
+      </w:pPr>
+      <w:r>
+        <w:t>The seller replies with text or a voice note. Voice notes are transcribed with Whisper.</w:t>
+      </w:r>
+    </w:p>
+    <w:p>
+      <w:pPr>
+        <w:pStyle w:val="ListNumber"/>
+      </w:pPr>
+      <w:r>
+        <w:t>The reply is turned into a structured fact, added to the product's knowledge base, and the question is marked answered.</w:t>
+      </w:r>
+    </w:p>
+    <w:p>
+      <w:pPr>
+        <w:pStyle w:val="ListNumber"/>
+      </w:pPr>
+      <w:r>
+        <w:t>The buyer page polls /api/buyer/thread and shows the answer; future similar questions are answered instantly from the learned fact.</w:t>
+      </w:r>
+    </w:p>
+    <w:p>
+      <w:pPr>
+        <w:pStyle w:val="Heading2"/>
+      </w:pPr>
+      <w:r>
+        <w:rPr>
+          <w:color w:val="075E54"/>
+        </w:rPr>
+        <w:t>4.6 Why this loop matters</w:t>
+      </w:r>
+    </w:p>
+    <w:p>
+      <w:pPr>
+        <w:pStyle w:val="ListBullet"/>
+      </w:pPr>
+      <w:r>
+        <w:t>The knowledge base grows from real buyer questions, so the maker answers each question once.</w:t>
+      </w:r>
+    </w:p>
+    <w:p>
+      <w:pPr>
+        <w:pStyle w:val="ListBullet"/>
+      </w:pPr>
+      <w:r>
+        <w:t>Uncertain or customisation questions still reach the human, preserving trust and cultural accuracy.</w:t>
+      </w:r>
+    </w:p>
+    <w:p>
+      <w:pPr>
+        <w:pStyle w:val="ListBullet"/>
+      </w:pPr>
+      <w:r>
+        <w:t>Because answers become confirmed facts, the same source-truth guard applies to anything published.</w:t>
       </w:r>
     </w:p>
     <w:p>
@@ -2097,6 +2328,160 @@
           </w:tcPr>
           <w:p>
             <w:r>
+              <w:t>GET /shop</w:t>
+            </w:r>
+          </w:p>
+        </w:tc>
+        <w:tc>
+          <w:tcPr>
+            <w:tcW w:type="dxa" w:w="4320"/>
+          </w:tcPr>
+          <w:p>
+            <w:r>
+              <w:t>Buyer storefront listing all published products.</w:t>
+            </w:r>
+          </w:p>
+        </w:tc>
+      </w:tr>
+      <w:tr>
+        <w:tc>
+          <w:tcPr>
+            <w:tcW w:type="dxa" w:w="4320"/>
+          </w:tcPr>
+          <w:p>
+            <w:r>
+              <w:t>GET /shop/{id}</w:t>
+            </w:r>
+          </w:p>
+        </w:tc>
+        <w:tc>
+          <w:tcPr>
+            <w:tcW w:type="dxa" w:w="4320"/>
+          </w:tcPr>
+          <w:p>
+            <w:r>
+              <w:t>Product page with the buyer Q&amp;A chat.</w:t>
+            </w:r>
+          </w:p>
+        </w:tc>
+      </w:tr>
+      <w:tr>
+        <w:tc>
+          <w:tcPr>
+            <w:tcW w:type="dxa" w:w="4320"/>
+          </w:tcPr>
+          <w:p>
+            <w:r>
+              <w:t>GET /api/catalog</w:t>
+            </w:r>
+          </w:p>
+        </w:tc>
+        <w:tc>
+          <w:tcPr>
+            <w:tcW w:type="dxa" w:w="4320"/>
+          </w:tcPr>
+          <w:p>
+            <w:r>
+              <w:t>Published products for the storefront.</w:t>
+            </w:r>
+          </w:p>
+        </w:tc>
+      </w:tr>
+      <w:tr>
+        <w:tc>
+          <w:tcPr>
+            <w:tcW w:type="dxa" w:w="4320"/>
+          </w:tcPr>
+          <w:p>
+            <w:r>
+              <w:t>POST /api/buyer/ask</w:t>
+            </w:r>
+          </w:p>
+        </w:tc>
+        <w:tc>
+          <w:tcPr>
+            <w:tcW w:type="dxa" w:w="4320"/>
+          </w:tcPr>
+          <w:p>
+            <w:r>
+              <w:t>Buyer question; answered from the knowledge base or escalated.</w:t>
+            </w:r>
+          </w:p>
+        </w:tc>
+      </w:tr>
+      <w:tr>
+        <w:tc>
+          <w:tcPr>
+            <w:tcW w:type="dxa" w:w="4320"/>
+          </w:tcPr>
+          <w:p>
+            <w:r>
+              <w:t>GET /api/buyer/thread/{id}</w:t>
+            </w:r>
+          </w:p>
+        </w:tc>
+        <w:tc>
+          <w:tcPr>
+            <w:tcW w:type="dxa" w:w="4320"/>
+          </w:tcPr>
+          <w:p>
+            <w:r>
+              <w:t>Buyer's questions and answers; polled for escalated answers.</w:t>
+            </w:r>
+          </w:p>
+        </w:tc>
+      </w:tr>
+      <w:tr>
+        <w:tc>
+          <w:tcPr>
+            <w:tcW w:type="dxa" w:w="4320"/>
+          </w:tcPr>
+          <w:p>
+            <w:r>
+              <w:t>GET /api/seller/questions</w:t>
+            </w:r>
+          </w:p>
+        </w:tc>
+        <w:tc>
+          <w:tcPr>
+            <w:tcW w:type="dxa" w:w="4320"/>
+          </w:tcPr>
+          <w:p>
+            <w:r>
+              <w:t>Pending buyer questions for a seller session.</w:t>
+            </w:r>
+          </w:p>
+        </w:tc>
+      </w:tr>
+      <w:tr>
+        <w:tc>
+          <w:tcPr>
+            <w:tcW w:type="dxa" w:w="4320"/>
+          </w:tcPr>
+          <w:p>
+            <w:r>
+              <w:t>POST /api/seller/answer</w:t>
+            </w:r>
+          </w:p>
+        </w:tc>
+        <w:tc>
+          <w:tcPr>
+            <w:tcW w:type="dxa" w:w="4320"/>
+          </w:tcPr>
+          <w:p>
+            <w:r>
+              <w:t>Seller answers a pending question (used by the simulator).</w:t>
+            </w:r>
+          </w:p>
+        </w:tc>
+      </w:tr>
+      <w:tr>
+        <w:tc>
+          <w:tcPr>
+            <w:tcW w:type="dxa" w:w="4320"/>
+          </w:tcPr>
+          <w:p>
+            <w:r>
               <w:t>GET /buyer/{id}</w:t>
             </w:r>
           </w:p>
@@ -2107,7 +2492,7 @@
           </w:tcPr>
           <w:p>
             <w:r>
-              <w:t>Shareable buyer page.</w:t>
+              <w:t>Shareable read-only buyer page with provenance.</w:t>
             </w:r>
           </w:p>
         </w:tc>
@@ -2358,6 +2743,14 @@
       </w:pPr>
       <w:r>
         <w:t>Offline smoke test (scripts/smoke_test.py and the single-file equivalent) covers interview, guard blocking, publish, buyer page, restart, retry, non-answer handling, voice, reset, invalid input, and the Twilio webhook - 28 checks, all passing.</w:t>
+      </w:r>
+    </w:p>
+    <w:p>
+      <w:pPr>
+        <w:pStyle w:val="ListBullet"/>
+      </w:pPr>
+      <w:r>
+        <w:t>Buyer-loop test: publish -&gt; catalog -&gt; storefront -&gt; buyer asks an answerable question (instant) and an unanswerable one (escalated) -&gt; seller answers -&gt; buyer sees it -&gt; the learned fact answers a similar question instantly.</w:t>
       </w:r>
     </w:p>
     <w:p>

</xml_diff>

<commit_message>
Add compulsory interview questions, buyer orders, and seller notification
Compulsory questions (making time, delivery, price, etc.) always asked and seeded into the knowledge base; buyers can order from the product page and the seller is notified on WhatsApp; add single-file smoke test and update docs.
</commit_message>
<xml_diff>
--- a/docs/Architecture_and_Proposed_Solution.docx
+++ b/docs/Architecture_and_Proposed_Solution.docx
@@ -734,7 +734,29 @@
           </w:tcPr>
           <w:p>
             <w:r>
-              <w:t>Guided questions (identity, material, care, process, variation, photo, cultural) with quick replies.</w:t>
+              <w:t>Guided questions with quick replies. Compulsory (always asked): identity, material, making time, delivery time, care, photo/exactness, cultural meaning, price. Optional: process, variation.</w:t>
+            </w:r>
+          </w:p>
+        </w:tc>
+      </w:tr>
+      <w:tr>
+        <w:tc>
+          <w:tcPr>
+            <w:tcW w:type="dxa" w:w="4320"/>
+          </w:tcPr>
+          <w:p>
+            <w:r>
+              <w:t>Order intake</w:t>
+            </w:r>
+          </w:p>
+        </w:tc>
+        <w:tc>
+          <w:tcPr>
+            <w:tcW w:type="dxa" w:w="4320"/>
+          </w:tcPr>
+          <w:p>
+            <w:r>
+              <w:t>Buyer places an order from the product page (price, quantity, contact); the order is stored and the seller is notified on WhatsApp.</w:t>
             </w:r>
           </w:p>
         </w:tc>
@@ -1170,6 +1192,14 @@
     </w:p>
     <w:p>
       <w:pPr>
+        <w:pStyle w:val="ListNumber"/>
+      </w:pPr>
+      <w:r>
+        <w:t>The buyer can order from the product page; the order carries the price and contact, and the seller is notified on WhatsApp and in the seller view.</w:t>
+      </w:r>
+    </w:p>
+    <w:p>
+      <w:pPr>
         <w:pStyle w:val="Heading2"/>
       </w:pPr>
       <w:r>
@@ -2135,7 +2165,7 @@
         <w:pStyle w:val="ListNumber"/>
       </w:pPr>
       <w:r>
-        <w:t>Bot asks up to seven short questions with quick-reply options.</w:t>
+        <w:t>Bot asks the compulsory questions (identity, material, making time, delivery time, care, photo/exactness, cultural meaning, price) plus optional process and variation, with quick-reply options.</w:t>
       </w:r>
     </w:p>
     <w:p>
@@ -2211,6 +2241,22 @@
       </w:pPr>
       <w:r>
         <w:t>Sees a note when unconfirmed claims were deliberately blocked.</w:t>
+      </w:r>
+    </w:p>
+    <w:p>
+      <w:pPr>
+        <w:pStyle w:val="ListNumber"/>
+      </w:pPr>
+      <w:r>
+        <w:t>Asks questions; the knowledge base answers instantly or the seller is asked.</w:t>
+      </w:r>
+    </w:p>
+    <w:p>
+      <w:pPr>
+        <w:pStyle w:val="ListNumber"/>
+      </w:pPr>
+      <w:r>
+        <w:t>Places an order (quantity and contact); the seller is notified on WhatsApp.</w:t>
       </w:r>
     </w:p>
     <w:p>

</xml_diff>